<commit_message>
fix: rebuild Stepstone resumes with the summary and skills corrections
The Stepstone job definitions are unchanged; these files pick up the
generator fixes shared with the Naukri batch:

- summary proof sentences now start with a capital letter (they read
  "...defect reporting. built a Playwright..." before)
- Selenium Grid, AWS, and SDLC/STLC added to the skill rows, and a new
  Platforms Tested row - all evidenced in the source resume already
- "framework design to script development" reworded to "through"

Note these five still lack the gapSkills treatment the Naukri batch
received: TOSCA, Pega, Appium, and client-facing consulting are named
by these JDs and absent from the resume, but are not yet surfaced as
placeholder rows in the documents.

Co-Authored-By: Claude Opus 5 <noreply@anthropic.com>
</commit_message>
<xml_diff>
--- a/04_JobKitAI/output/stepstone/Materna_Test_Automation_Engineer_Vishnudeep_Jayam.docx
+++ b/04_JobKitAI/output/stepstone/Materna_Test_Automation_Engineer_Vishnudeep_Jayam.docx
@@ -68,7 +68,7 @@
         </w:rPr>
         <w:t xml:space="preserve">  •  </w:t>
       </w:r>
-      <w:hyperlink w:history="1" r:id="rId_hvhxre0krdhjxhuu9gti">
+      <w:hyperlink w:history="1" r:id="rId-kayhyk6oe4nopeytekv9">
         <w:r>
           <w:rPr>
             <w:rFonts w:ascii="Calibri" w:cs="Calibri" w:eastAsia="Calibri" w:hAnsi="Calibri"/>
@@ -160,7 +160,7 @@
           <w:sz w:val="20"/>
           <w:szCs w:val="20"/>
         </w:rPr>
-        <w:t xml:space="preserve"> of experience across UI and API test automation — from tool selection and framework design to script development, suite execution, and defect reporting. </w:t>
+        <w:t xml:space="preserve"> of experience across UI and API test automation — from tool selection and framework design through script development, suite execution, and defect reporting. </w:t>
       </w:r>
       <w:r>
         <w:rPr>
@@ -171,7 +171,7 @@
           <w:highlight w:val="yellow"/>
           <w:highlightCs w:val="yellow"/>
         </w:rPr>
-        <w:t xml:space="preserve">built a Playwright + TypeScript automation framework for web applications and led Cucumber-based automation across Windows, Android, and iOS</w:t>
+        <w:t xml:space="preserve">Built a Playwright + TypeScript automation framework for web applications and led Cucumber-based automation across Windows, Android, and iOS</w:t>
       </w:r>
       <w:r>
         <w:rPr>
@@ -191,7 +191,7 @@
           <w:highlight w:val="yellow"/>
           <w:highlightCs w:val="yellow"/>
         </w:rPr>
-        <w:t xml:space="preserve">delivered cross-platform automation spanning Windows, Android, iOS, and web</w:t>
+        <w:t xml:space="preserve">Delivered cross-platform automation spanning Windows, Android, iOS, and web</w:t>
       </w:r>
       <w:r>
         <w:rPr>
@@ -276,7 +276,18 @@
           <w:sz w:val="20"/>
           <w:szCs w:val="20"/>
         </w:rPr>
-        <w:t xml:space="preserve"> · Cucumber (BDD) · TestNG · Page Object Model</w:t>
+        <w:t xml:space="preserve"> · Cucumber (BDD) · TestNG · Page Object Model · </w:t>
+      </w:r>
+      <w:r>
+        <w:rPr>
+          <w:rFonts w:ascii="Calibri" w:cs="Calibri" w:eastAsia="Calibri" w:hAnsi="Calibri"/>
+          <w:color w:val="3D4451"/>
+          <w:sz w:val="20"/>
+          <w:szCs w:val="20"/>
+          <w:highlight w:val="yellow"/>
+          <w:highlightCs w:val="yellow"/>
+        </w:rPr>
+        <w:t xml:space="preserve">Selenium Grid</w:t>
       </w:r>
     </w:p>
     <w:p>
@@ -342,16 +353,16 @@
           <w:sz w:val="20"/>
           <w:szCs w:val="20"/>
         </w:rPr>
-        <w:t xml:space="preserve">CI/CD &amp; Build Tools  </w:t>
-      </w:r>
-      <w:r>
-        <w:rPr>
-          <w:rFonts w:ascii="Calibri" w:cs="Calibri" w:eastAsia="Calibri" w:hAnsi="Calibri"/>
-          <w:color w:val="3D4451"/>
-          <w:sz w:val="20"/>
-          <w:szCs w:val="20"/>
-        </w:rPr>
-        <w:t xml:space="preserve">Jenkins · Gradle · Maven · Travis CI · Git · GitHub</w:t>
+        <w:t xml:space="preserve">CI/CD, Build &amp; Cloud  </w:t>
+      </w:r>
+      <w:r>
+        <w:rPr>
+          <w:rFonts w:ascii="Calibri" w:cs="Calibri" w:eastAsia="Calibri" w:hAnsi="Calibri"/>
+          <w:color w:val="3D4451"/>
+          <w:sz w:val="20"/>
+          <w:szCs w:val="20"/>
+        </w:rPr>
+        <w:t xml:space="preserve">Jenkins · Gradle · Maven · Travis CI · Git · GitHub · AWS</w:t>
       </w:r>
     </w:p>
     <w:p>
@@ -376,7 +387,43 @@
           <w:sz w:val="20"/>
           <w:szCs w:val="20"/>
         </w:rPr>
-        <w:t xml:space="preserve">TestRail · XRay · Jira · Agile Scrum · Kanban · Test Planning &amp; Case Design · Defect Tracking &amp; Reporting</w:t>
+        <w:t xml:space="preserve">TestRail · XRay · Jira · Agile Scrum · Kanban · Test Planning &amp; Case Design · Defect Tracking &amp; Reporting · SDLC / STLC</w:t>
+      </w:r>
+    </w:p>
+    <w:p>
+      <w:pPr>
+        <w:spacing w:after="55" w:line="250"/>
+      </w:pPr>
+      <w:r>
+        <w:rPr>
+          <w:rFonts w:ascii="Calibri" w:cs="Calibri" w:eastAsia="Calibri" w:hAnsi="Calibri"/>
+          <w:b/>
+          <w:bCs/>
+          <w:color w:val="1A1A1A"/>
+          <w:sz w:val="20"/>
+          <w:szCs w:val="20"/>
+        </w:rPr>
+        <w:t xml:space="preserve">Platforms Tested  </w:t>
+      </w:r>
+      <w:r>
+        <w:rPr>
+          <w:rFonts w:ascii="Calibri" w:cs="Calibri" w:eastAsia="Calibri" w:hAnsi="Calibri"/>
+          <w:color w:val="3D4451"/>
+          <w:sz w:val="20"/>
+          <w:szCs w:val="20"/>
+        </w:rPr>
+        <w:t xml:space="preserve">Web (Chrome, Firefox, IE) · Windows Desktop · Android · iOS · </w:t>
+      </w:r>
+      <w:r>
+        <w:rPr>
+          <w:rFonts w:ascii="Calibri" w:cs="Calibri" w:eastAsia="Calibri" w:hAnsi="Calibri"/>
+          <w:color w:val="3D4451"/>
+          <w:sz w:val="20"/>
+          <w:szCs w:val="20"/>
+          <w:highlight w:val="yellow"/>
+          <w:highlightCs w:val="yellow"/>
+        </w:rPr>
+        <w:t xml:space="preserve">Mobile / Tablet</w:t>
       </w:r>
     </w:p>
     <w:p>

</xml_diff>